<commit_message>
Improve Q4 bounds and certify Q5 plan
</commit_message>
<xml_diff>
--- a/deliverables/CUMCM2025A_组员交接说明_20260826.docx
+++ b/deliverables/CUMCM2025A_组员交接说明_20260826.docx
@@ -506,7 +506,66 @@
           <w:color w:val="000000"/>
           <w:sz w:val="21"/>
         </w:rPr>
-        <w:t>已审计多球联合遮蔽，但完整八维域全局最优未证。</w:t>
+        <w:t>完整域已按实际贡献弹数分解：单弹层上界 7.0 s，两弹完整航向域上界 8.18 s，三弹完整航向域向外取整上界 10.351 s；因此 Q3 完整域已有 10.351 s 统一安全上界，但全局最优仍未证。</w:t>
+      </w:r>
+    </w:p>
+    <w:p>
+      <w:pPr>
+        <w:spacing w:after="80" w:line="300" w:lineRule="auto"/>
+        <w:numPr>
+          <w:ilvl w:val="0"/>
+          <w:numId w:val="12"/>
+        </w:numPr>
+      </w:pPr>
+      <w:r>
+        <w:rPr>
+          <w:rFonts w:ascii="Calibri" w:hAnsi="Calibri" w:eastAsia="Microsoft YaHei"/>
+          <w:b w:val="0"/>
+          <w:i w:val="0"/>
+          <w:color w:val="000000"/>
+          <w:sz w:val="21"/>
+        </w:rPr>
+        <w:t xml:space="preserve">两弹只剩“起爆顺序与投放顺序一致、航向 </w:t>
+      </w:r>
+      <w:r>
+        <w:rPr>
+          <w:rFonts w:ascii="Consolas" w:hAnsi="Consolas" w:eastAsia="Microsoft YaHei"/>
+          <w:b w:val="0"/>
+          <w:i w:val="0"/>
+          <w:color w:val="1F4D78"/>
+          <w:sz w:val="20"/>
+        </w:rPr>
+        <w:t>[177.1875°,180°]</w:t>
+      </w:r>
+      <w:r>
+        <w:rPr>
+          <w:rFonts w:ascii="Calibri" w:hAnsi="Calibri" w:eastAsia="Microsoft YaHei"/>
+          <w:b w:val="0"/>
+          <w:i w:val="0"/>
+          <w:color w:val="000000"/>
+          <w:sz w:val="21"/>
+        </w:rPr>
+        <w:t xml:space="preserve">”的 8 s 目标未闭合；三弹未闭合航向只在 </w:t>
+      </w:r>
+      <w:r>
+        <w:rPr>
+          <w:rFonts w:ascii="Consolas" w:hAnsi="Consolas" w:eastAsia="Microsoft YaHei"/>
+          <w:b w:val="0"/>
+          <w:i w:val="0"/>
+          <w:color w:val="1F4D78"/>
+          <w:sz w:val="20"/>
+        </w:rPr>
+        <w:t>[168.75°,185.625°]</w:t>
+      </w:r>
+      <w:r>
+        <w:rPr>
+          <w:rFonts w:ascii="Calibri" w:hAnsi="Calibri" w:eastAsia="Microsoft YaHei"/>
+          <w:b w:val="0"/>
+          <w:i w:val="0"/>
+          <w:color w:val="000000"/>
+          <w:sz w:val="21"/>
+        </w:rPr>
+        <w:t>。</w:t>
       </w:r>
     </w:p>
     <w:p>
@@ -595,7 +654,47 @@
           <w:color w:val="1F4D78"/>
           <w:sz w:val="20"/>
         </w:rPr>
-        <w:t>Q3上界认证与最终结论.md</w:t>
+        <w:t>q3_upper_velocity_branch_bound.py</w:t>
+      </w:r>
+      <w:r>
+        <w:rPr>
+          <w:rFonts w:ascii="Calibri" w:hAnsi="Calibri" w:eastAsia="Microsoft YaHei"/>
+          <w:b w:val="0"/>
+          <w:i w:val="0"/>
+          <w:color w:val="000000"/>
+          <w:sz w:val="21"/>
+        </w:rPr>
+        <w:t>、</w:t>
+      </w:r>
+      <w:r>
+        <w:rPr>
+          <w:rFonts w:ascii="Consolas" w:hAnsi="Consolas" w:eastAsia="Microsoft YaHei"/>
+          <w:b w:val="0"/>
+          <w:i w:val="0"/>
+          <w:color w:val="1F4D78"/>
+          <w:sz w:val="20"/>
+        </w:rPr>
+        <w:t>q3_velocity_domain_audit.py</w:t>
+      </w:r>
+      <w:r>
+        <w:rPr>
+          <w:rFonts w:ascii="Calibri" w:hAnsi="Calibri" w:eastAsia="Microsoft YaHei"/>
+          <w:b w:val="0"/>
+          <w:i w:val="0"/>
+          <w:color w:val="000000"/>
+          <w:sz w:val="21"/>
+        </w:rPr>
+        <w:t>、</w:t>
+      </w:r>
+      <w:r>
+        <w:rPr>
+          <w:rFonts w:ascii="Consolas" w:hAnsi="Consolas" w:eastAsia="Microsoft YaHei"/>
+          <w:b w:val="0"/>
+          <w:i w:val="0"/>
+          <w:color w:val="1F4D78"/>
+          <w:sz w:val="20"/>
+        </w:rPr>
+        <w:t>Q3完整域分解与航向认证_20260829.md</w:t>
       </w:r>
       <w:r>
         <w:rPr>
@@ -651,7 +750,7 @@
           <w:color w:val="000000"/>
           <w:sz w:val="21"/>
         </w:rPr>
-        <w:t>正式累计时长为 11.735130825 s；主分支上界为 11.839 s。</w:t>
+        <w:t>正式累计时长为 11.735130825 s；主分支上界为 11.814 s。</w:t>
       </w:r>
     </w:p>
     <w:p>
@@ -817,7 +916,7 @@
           <w:color w:val="000000"/>
           <w:sz w:val="21"/>
         </w:rPr>
-        <w:t>完成五机多弹对三枚导弹的分层候选、组合筛选、整机分块精修和连续域认证。</w:t>
+        <w:t>完成五机多弹对三枚导弹的分层候选、组合筛选、空槽攻击、零边际剪枝、整机分块精修，以及固定方案的连续域上下界聚合认证。</w:t>
       </w:r>
     </w:p>
     <w:p>
@@ -836,7 +935,7 @@
           <w:color w:val="000000"/>
           <w:sz w:val="21"/>
         </w:rPr>
-        <w:t>当前 11 弹方案：</w:t>
+        <w:t xml:space="preserve">当前 13 弹方案按 FY1-FY5 分配为 </w:t>
       </w:r>
       <w:r>
         <w:rPr>
@@ -846,7 +945,27 @@
           <w:color w:val="1F4D78"/>
           <w:sz w:val="20"/>
         </w:rPr>
-        <w:t>J_sum = 35.109171990 s</w:t>
+        <w:t>3/2/2/3/3</w:t>
+      </w:r>
+      <w:r>
+        <w:rPr>
+          <w:rFonts w:ascii="Calibri" w:hAnsi="Calibri" w:eastAsia="Microsoft YaHei"/>
+          <w:b w:val="0"/>
+          <w:i w:val="0"/>
+          <w:color w:val="000000"/>
+          <w:sz w:val="21"/>
+        </w:rPr>
+        <w:t>：</w:t>
+      </w:r>
+      <w:r>
+        <w:rPr>
+          <w:rFonts w:ascii="Consolas" w:hAnsi="Consolas" w:eastAsia="Microsoft YaHei"/>
+          <w:b w:val="0"/>
+          <w:i w:val="0"/>
+          <w:color w:val="1F4D78"/>
+          <w:sz w:val="20"/>
+        </w:rPr>
+        <w:t>J_sum = 40.691495885762 s</w:t>
       </w:r>
       <w:r>
         <w:rPr>
@@ -866,7 +985,7 @@
           <w:color w:val="1F4D78"/>
           <w:sz w:val="20"/>
         </w:rPr>
-        <w:t>J_min = 7.499774830 s</w:t>
+        <w:t>J_min = 7.499774830204 s</w:t>
       </w:r>
       <w:r>
         <w:rPr>
@@ -886,7 +1005,27 @@
           <w:color w:val="1F4D78"/>
           <w:sz w:val="20"/>
         </w:rPr>
-        <w:t>J_all = 1.439349 s</w:t>
+        <w:t>J_all = 5.615695576217 s</w:t>
+      </w:r>
+      <w:r>
+        <w:rPr>
+          <w:rFonts w:ascii="Calibri" w:hAnsi="Calibri" w:eastAsia="Microsoft YaHei"/>
+          <w:b w:val="0"/>
+          <w:i w:val="0"/>
+          <w:color w:val="000000"/>
+          <w:sz w:val="21"/>
+        </w:rPr>
+        <w:t xml:space="preserve">；分导弹时长依次为 </w:t>
+      </w:r>
+      <w:r>
+        <w:rPr>
+          <w:rFonts w:ascii="Consolas" w:hAnsi="Consolas" w:eastAsia="Microsoft YaHei"/>
+          <w:b w:val="0"/>
+          <w:i w:val="0"/>
+          <w:color w:val="1F4D78"/>
+          <w:sz w:val="20"/>
+        </w:rPr>
+        <w:t>23.950139827944/7.499774830204/9.241581227614 s</w:t>
       </w:r>
       <w:r>
         <w:rPr>
@@ -915,7 +1054,47 @@
           <w:color w:val="000000"/>
           <w:sz w:val="21"/>
         </w:rPr>
-        <w:t xml:space="preserve">给定方案的 </w:t>
+        <w:t xml:space="preserve">三位小数回代为 </w:t>
+      </w:r>
+      <w:r>
+        <w:rPr>
+          <w:rFonts w:ascii="Consolas" w:hAnsi="Consolas" w:eastAsia="Microsoft YaHei"/>
+          <w:b w:val="0"/>
+          <w:i w:val="0"/>
+          <w:color w:val="1F4D78"/>
+          <w:sz w:val="20"/>
+        </w:rPr>
+        <w:t>40.629254654355 s</w:t>
+      </w:r>
+      <w:r>
+        <w:rPr>
+          <w:rFonts w:ascii="Calibri" w:hAnsi="Calibri" w:eastAsia="Microsoft YaHei"/>
+          <w:b w:val="0"/>
+          <w:i w:val="0"/>
+          <w:color w:val="000000"/>
+          <w:sz w:val="21"/>
+        </w:rPr>
+        <w:t>。在同一正式评价流程下，</w:t>
+      </w:r>
+      <w:r>
+        <w:rPr>
+          <w:rFonts w:ascii="Consolas" w:hAnsi="Consolas" w:eastAsia="Microsoft YaHei"/>
+          <w:b w:val="0"/>
+          <w:i w:val="0"/>
+          <w:color w:val="1F4D78"/>
+          <w:sz w:val="20"/>
+        </w:rPr>
+        <w:t>g=9.79/9.80/9.81 m/s²</w:t>
+      </w:r>
+      <w:r>
+        <w:rPr>
+          <w:rFonts w:ascii="Calibri" w:hAnsi="Calibri" w:eastAsia="Microsoft YaHei"/>
+          <w:b w:val="0"/>
+          <w:i w:val="0"/>
+          <w:color w:val="000000"/>
+          <w:sz w:val="21"/>
+        </w:rPr>
+        <w:t xml:space="preserve"> 时 </w:t>
       </w:r>
       <w:r>
         <w:rPr>
@@ -935,7 +1114,7 @@
           <w:color w:val="000000"/>
           <w:sz w:val="21"/>
         </w:rPr>
-        <w:t xml:space="preserve"> 连续域夹逼为 </w:t>
+        <w:t xml:space="preserve"> 分别为 </w:t>
       </w:r>
       <w:r>
         <w:rPr>
@@ -945,7 +1124,7 @@
           <w:color w:val="1F4D78"/>
           <w:sz w:val="20"/>
         </w:rPr>
-        <w:t>[35.067366178, 35.112385634] s</w:t>
+        <w:t>40.673022737227/40.728292987548/40.301901850977 s</w:t>
       </w:r>
       <w:r>
         <w:rPr>
@@ -956,6 +1135,105 @@
           <w:sz w:val="21"/>
         </w:rPr>
         <w:t>。</w:t>
+      </w:r>
+    </w:p>
+    <w:p>
+      <w:pPr>
+        <w:spacing w:after="80" w:line="300" w:lineRule="auto"/>
+        <w:numPr>
+          <w:ilvl w:val="0"/>
+          <w:numId w:val="14"/>
+        </w:numPr>
+      </w:pPr>
+      <w:r>
+        <w:rPr>
+          <w:rFonts w:ascii="Calibri" w:hAnsi="Calibri" w:eastAsia="Microsoft YaHei"/>
+          <w:b w:val="0"/>
+          <w:i w:val="0"/>
+          <w:color w:val="000000"/>
+          <w:sz w:val="21"/>
+        </w:rPr>
+        <w:t>给定方案的连续域夹逼为：</w:t>
+      </w:r>
+      <w:r>
+        <w:rPr>
+          <w:rFonts w:ascii="Consolas" w:hAnsi="Consolas" w:eastAsia="Microsoft YaHei"/>
+          <w:b w:val="0"/>
+          <w:i w:val="0"/>
+          <w:color w:val="1F4D78"/>
+          <w:sz w:val="20"/>
+        </w:rPr>
+        <w:t>J_sum ∈ [40.144267859831, 40.695414539975] s</w:t>
+      </w:r>
+      <w:r>
+        <w:rPr>
+          <w:rFonts w:ascii="Calibri" w:hAnsi="Calibri" w:eastAsia="Microsoft YaHei"/>
+          <w:b w:val="0"/>
+          <w:i w:val="0"/>
+          <w:color w:val="000000"/>
+          <w:sz w:val="21"/>
+        </w:rPr>
+        <w:t>、</w:t>
+      </w:r>
+      <w:r>
+        <w:rPr>
+          <w:rFonts w:ascii="Consolas" w:hAnsi="Consolas" w:eastAsia="Microsoft YaHei"/>
+          <w:b w:val="0"/>
+          <w:i w:val="0"/>
+          <w:color w:val="1F4D78"/>
+          <w:sz w:val="20"/>
+        </w:rPr>
+        <w:t>J_min ∈ [7.343790580860, 7.500191752063] s</w:t>
+      </w:r>
+      <w:r>
+        <w:rPr>
+          <w:rFonts w:ascii="Calibri" w:hAnsi="Calibri" w:eastAsia="Microsoft YaHei"/>
+          <w:b w:val="0"/>
+          <w:i w:val="0"/>
+          <w:color w:val="000000"/>
+          <w:sz w:val="21"/>
+        </w:rPr>
+        <w:t>、</w:t>
+      </w:r>
+      <w:r>
+        <w:rPr>
+          <w:rFonts w:ascii="Consolas" w:hAnsi="Consolas" w:eastAsia="Microsoft YaHei"/>
+          <w:b w:val="0"/>
+          <w:i w:val="0"/>
+          <w:color w:val="1F4D78"/>
+          <w:sz w:val="20"/>
+        </w:rPr>
+        <w:t>J_all ∈ [5.348435792648, 5.617196875029] s</w:t>
+      </w:r>
+      <w:r>
+        <w:rPr>
+          <w:rFonts w:ascii="Calibri" w:hAnsi="Calibri" w:eastAsia="Microsoft YaHei"/>
+          <w:b w:val="0"/>
+          <w:i w:val="0"/>
+          <w:color w:val="000000"/>
+          <w:sz w:val="21"/>
+        </w:rPr>
+        <w:t xml:space="preserve">；上端只认证该固定方案的连续评价值，不是完整优化域上界。密网格联合新增时长约 </w:t>
+      </w:r>
+      <w:r>
+        <w:rPr>
+          <w:rFonts w:ascii="Consolas" w:hAnsi="Consolas" w:eastAsia="Microsoft YaHei"/>
+          <w:b w:val="0"/>
+          <w:i w:val="0"/>
+          <w:color w:val="1F4D78"/>
+          <w:sz w:val="20"/>
+        </w:rPr>
+        <w:t>1.997216230 s</w:t>
+      </w:r>
+      <w:r>
+        <w:rPr>
+          <w:rFonts w:ascii="Calibri" w:hAnsi="Calibri" w:eastAsia="Microsoft YaHei"/>
+          <w:b w:val="0"/>
+          <w:i w:val="0"/>
+          <w:color w:val="000000"/>
+          <w:sz w:val="21"/>
+        </w:rPr>
+        <w:t>，仅作近似诊断，不能冒充连续域协同增益下界。</w:t>
       </w:r>
     </w:p>
     <w:p>
@@ -1024,7 +1302,7 @@
           <w:color w:val="1F4D78"/>
           <w:sz w:val="20"/>
         </w:rPr>
-        <w:t>Q5深挖与认证总结.md</w:t>
+        <w:t>q5_merge_lower_certificates.py</w:t>
       </w:r>
       <w:r>
         <w:rPr>
@@ -1034,7 +1312,7 @@
           <w:color w:val="000000"/>
           <w:sz w:val="21"/>
         </w:rPr>
-        <w:t xml:space="preserve"> 及全部 </w:t>
+        <w:t>、</w:t>
       </w:r>
       <w:r>
         <w:rPr>
@@ -1044,7 +1322,167 @@
           <w:color w:val="1F4D78"/>
           <w:sz w:val="20"/>
         </w:rPr>
-        <w:t>q5_*.json</w:t>
+        <w:t>q5_aggregate_certificate.py</w:t>
+      </w:r>
+      <w:r>
+        <w:rPr>
+          <w:rFonts w:ascii="Calibri" w:hAnsi="Calibri" w:eastAsia="Microsoft YaHei"/>
+          <w:b w:val="0"/>
+          <w:i w:val="0"/>
+          <w:color w:val="000000"/>
+          <w:sz w:val="21"/>
+        </w:rPr>
+        <w:t>、</w:t>
+      </w:r>
+      <w:r>
+        <w:rPr>
+          <w:rFonts w:ascii="Consolas" w:hAnsi="Consolas" w:eastAsia="Microsoft YaHei"/>
+          <w:b w:val="0"/>
+          <w:i w:val="0"/>
+          <w:color w:val="1F4D78"/>
+          <w:sz w:val="20"/>
+        </w:rPr>
+        <w:t>q5_final_plan.json</w:t>
+      </w:r>
+      <w:r>
+        <w:rPr>
+          <w:rFonts w:ascii="Calibri" w:hAnsi="Calibri" w:eastAsia="Microsoft YaHei"/>
+          <w:b w:val="0"/>
+          <w:i w:val="0"/>
+          <w:color w:val="000000"/>
+          <w:sz w:val="21"/>
+        </w:rPr>
+        <w:t>、</w:t>
+      </w:r>
+      <w:r>
+        <w:rPr>
+          <w:rFonts w:ascii="Consolas" w:hAnsi="Consolas" w:eastAsia="Microsoft YaHei"/>
+          <w:b w:val="0"/>
+          <w:i w:val="0"/>
+          <w:color w:val="1F4D78"/>
+          <w:sz w:val="20"/>
+        </w:rPr>
+        <w:t>q5_final_validation.json</w:t>
+      </w:r>
+      <w:r>
+        <w:rPr>
+          <w:rFonts w:ascii="Calibri" w:hAnsi="Calibri" w:eastAsia="Microsoft YaHei"/>
+          <w:b w:val="0"/>
+          <w:i w:val="0"/>
+          <w:color w:val="000000"/>
+          <w:sz w:val="21"/>
+        </w:rPr>
+        <w:t>、</w:t>
+      </w:r>
+      <w:r>
+        <w:rPr>
+          <w:rFonts w:ascii="Consolas" w:hAnsi="Consolas" w:eastAsia="Microsoft YaHei"/>
+          <w:b w:val="0"/>
+          <w:i w:val="0"/>
+          <w:color w:val="1F4D78"/>
+          <w:sz w:val="20"/>
+        </w:rPr>
+        <w:t>q5_final_bomb_table.json</w:t>
+      </w:r>
+      <w:r>
+        <w:rPr>
+          <w:rFonts w:ascii="Calibri" w:hAnsi="Calibri" w:eastAsia="Microsoft YaHei"/>
+          <w:b w:val="0"/>
+          <w:i w:val="0"/>
+          <w:color w:val="000000"/>
+          <w:sz w:val="21"/>
+        </w:rPr>
+        <w:t>、</w:t>
+      </w:r>
+      <w:r>
+        <w:rPr>
+          <w:rFonts w:ascii="Consolas" w:hAnsi="Consolas" w:eastAsia="Microsoft YaHei"/>
+          <w:b w:val="0"/>
+          <w:i w:val="0"/>
+          <w:color w:val="1F4D78"/>
+          <w:sz w:val="20"/>
+        </w:rPr>
+        <w:t>q5_final_multistart.json</w:t>
+      </w:r>
+      <w:r>
+        <w:rPr>
+          <w:rFonts w:ascii="Calibri" w:hAnsi="Calibri" w:eastAsia="Microsoft YaHei"/>
+          <w:b w:val="0"/>
+          <w:i w:val="0"/>
+          <w:color w:val="000000"/>
+          <w:sz w:val="21"/>
+        </w:rPr>
+        <w:t>、</w:t>
+      </w:r>
+      <w:r>
+        <w:rPr>
+          <w:rFonts w:ascii="Consolas" w:hAnsi="Consolas" w:eastAsia="Microsoft YaHei"/>
+          <w:b w:val="0"/>
+          <w:i w:val="0"/>
+          <w:color w:val="1F4D78"/>
+          <w:sz w:val="20"/>
+        </w:rPr>
+        <w:t>q5_final_continuous_lower.json</w:t>
+      </w:r>
+      <w:r>
+        <w:rPr>
+          <w:rFonts w:ascii="Calibri" w:hAnsi="Calibri" w:eastAsia="Microsoft YaHei"/>
+          <w:b w:val="0"/>
+          <w:i w:val="0"/>
+          <w:color w:val="000000"/>
+          <w:sz w:val="21"/>
+        </w:rPr>
+        <w:t>、</w:t>
+      </w:r>
+      <w:r>
+        <w:rPr>
+          <w:rFonts w:ascii="Consolas" w:hAnsi="Consolas" w:eastAsia="Microsoft YaHei"/>
+          <w:b w:val="0"/>
+          <w:i w:val="0"/>
+          <w:color w:val="1F4D78"/>
+          <w:sz w:val="20"/>
+        </w:rPr>
+        <w:t>q5_final_continuous_upper.json</w:t>
+      </w:r>
+      <w:r>
+        <w:rPr>
+          <w:rFonts w:ascii="Calibri" w:hAnsi="Calibri" w:eastAsia="Microsoft YaHei"/>
+          <w:b w:val="0"/>
+          <w:i w:val="0"/>
+          <w:color w:val="000000"/>
+          <w:sz w:val="21"/>
+        </w:rPr>
+        <w:t>、</w:t>
+      </w:r>
+      <w:r>
+        <w:rPr>
+          <w:rFonts w:ascii="Consolas" w:hAnsi="Consolas" w:eastAsia="Microsoft YaHei"/>
+          <w:b w:val="0"/>
+          <w:i w:val="0"/>
+          <w:color w:val="1F4D78"/>
+          <w:sz w:val="20"/>
+        </w:rPr>
+        <w:t>q5_final_aggregate_certificate.json</w:t>
+      </w:r>
+      <w:r>
+        <w:rPr>
+          <w:rFonts w:ascii="Calibri" w:hAnsi="Calibri" w:eastAsia="Microsoft YaHei"/>
+          <w:b w:val="0"/>
+          <w:i w:val="0"/>
+          <w:color w:val="000000"/>
+          <w:sz w:val="21"/>
+        </w:rPr>
+        <w:t>、</w:t>
+      </w:r>
+      <w:r>
+        <w:rPr>
+          <w:rFonts w:ascii="Consolas" w:hAnsi="Consolas" w:eastAsia="Microsoft YaHei"/>
+          <w:b w:val="0"/>
+          <w:i w:val="0"/>
+          <w:color w:val="1F4D78"/>
+          <w:sz w:val="20"/>
+        </w:rPr>
+        <w:t>Q5深挖与认证总结.md</w:t>
       </w:r>
       <w:r>
         <w:rPr>
@@ -1316,7 +1754,47 @@
           <w:color w:val="000000"/>
           <w:sz w:val="21"/>
         </w:rPr>
-        <w:t>给 Q2-Q5 统一命令行参数、随机种子、输出目录、运行时间和逐次多起点日志；尤其补齐 Q5 九次多起点的逐次记录。</w:t>
+        <w:t xml:space="preserve">给 Q2-Q5 统一命令行参数、随机种子、输出目录和运行时间；Q5 的 </w:t>
+      </w:r>
+      <w:r>
+        <w:rPr>
+          <w:rFonts w:ascii="Consolas" w:hAnsi="Consolas" w:eastAsia="Microsoft YaHei"/>
+          <w:b w:val="0"/>
+          <w:i w:val="0"/>
+          <w:color w:val="1F4D78"/>
+          <w:sz w:val="20"/>
+        </w:rPr>
+        <w:t>q5_final_multistart.json</w:t>
+      </w:r>
+      <w:r>
+        <w:rPr>
+          <w:rFonts w:ascii="Calibri" w:hAnsi="Calibri" w:eastAsia="Microsoft YaHei"/>
+          <w:b w:val="0"/>
+          <w:i w:val="0"/>
+          <w:color w:val="000000"/>
+          <w:sz w:val="21"/>
+        </w:rPr>
+        <w:t xml:space="preserve"> 已在 </w:t>
+      </w:r>
+      <w:r>
+        <w:rPr>
+          <w:rFonts w:ascii="Consolas" w:hAnsi="Consolas" w:eastAsia="Microsoft YaHei"/>
+          <w:b w:val="0"/>
+          <w:i w:val="0"/>
+          <w:color w:val="1F4D78"/>
+          <w:sz w:val="20"/>
+        </w:rPr>
+        <w:t>attempts</w:t>
+      </w:r>
+      <w:r>
+        <w:rPr>
+          <w:rFonts w:ascii="Calibri" w:hAnsi="Calibri" w:eastAsia="Microsoft YaHei"/>
+          <w:b w:val="0"/>
+          <w:i w:val="0"/>
+          <w:color w:val="000000"/>
+          <w:sz w:val="21"/>
+        </w:rPr>
+        <w:t xml:space="preserve"> 中持久化九次逐次结果，需把该格式纳入回归检查。</w:t>
       </w:r>
     </w:p>
     <w:p>
@@ -1563,7 +2041,7 @@
           <w:color w:val="000000"/>
           <w:sz w:val="21"/>
         </w:rPr>
-        <w:t>复核 Q2 连续段上界、Q3 核心分支 7.9 s 上界、Q4 主分支 11.839 s 上界，逐条注明假设、必要条件和适用域。</w:t>
+        <w:t>复核 Q2 连续段上界、Q3 核心分支 7.9 s/两弹 8.18 s/完整域 10.351 s 三层上界、Q4 主分支 11.814 s 上界，逐条注明假设、必要条件和适用域。</w:t>
       </w:r>
     </w:p>
     <w:p>
@@ -2530,7 +3008,47 @@
           <w:color w:val="000000"/>
           <w:sz w:val="21"/>
         </w:rPr>
-        <w:t>Q5 九次多起点逐次 JSON 日志，而不只是三个模块的最好结果。</w:t>
+        <w:t xml:space="preserve">核对 </w:t>
+      </w:r>
+      <w:r>
+        <w:rPr>
+          <w:rFonts w:ascii="Consolas" w:hAnsi="Consolas" w:eastAsia="Microsoft YaHei"/>
+          <w:b w:val="0"/>
+          <w:i w:val="0"/>
+          <w:color w:val="1F4D78"/>
+          <w:sz w:val="20"/>
+        </w:rPr>
+        <w:t>q5_final_multistart.json</w:t>
+      </w:r>
+      <w:r>
+        <w:rPr>
+          <w:rFonts w:ascii="Calibri" w:hAnsi="Calibri" w:eastAsia="Microsoft YaHei"/>
+          <w:b w:val="0"/>
+          <w:i w:val="0"/>
+          <w:color w:val="000000"/>
+          <w:sz w:val="21"/>
+        </w:rPr>
+        <w:t xml:space="preserve"> 的九次 </w:t>
+      </w:r>
+      <w:r>
+        <w:rPr>
+          <w:rFonts w:ascii="Consolas" w:hAnsi="Consolas" w:eastAsia="Microsoft YaHei"/>
+          <w:b w:val="0"/>
+          <w:i w:val="0"/>
+          <w:color w:val="1F4D78"/>
+          <w:sz w:val="20"/>
+        </w:rPr>
+        <w:t>attempts</w:t>
+      </w:r>
+      <w:r>
+        <w:rPr>
+          <w:rFonts w:ascii="Calibri" w:hAnsi="Calibri" w:eastAsia="Microsoft YaHei"/>
+          <w:b w:val="0"/>
+          <w:i w:val="0"/>
+          <w:color w:val="000000"/>
+          <w:sz w:val="21"/>
+        </w:rPr>
+        <w:t>，并补充自动检查以防后续运行退化为只保存三个模块最佳值。</w:t>
       </w:r>
     </w:p>
     <w:p>
@@ -2922,7 +3440,27 @@
           <w:color w:val="000000"/>
           <w:sz w:val="21"/>
         </w:rPr>
-        <w:t>Q5 多目标 Pareto 对照和九次多起点日志尚未闭合。</w:t>
+        <w:t xml:space="preserve">Q5 九次多起点日志和固定方案连续域夹逼已经闭合；当前首要缺口转为补充 </w:t>
+      </w:r>
+      <w:r>
+        <w:rPr>
+          <w:rFonts w:ascii="Consolas" w:hAnsi="Consolas" w:eastAsia="Microsoft YaHei"/>
+          <w:b w:val="0"/>
+          <w:i w:val="0"/>
+          <w:color w:val="1F4D78"/>
+          <w:sz w:val="20"/>
+        </w:rPr>
+        <w:t>J_sum-J_min/J_all</w:t>
+      </w:r>
+      <w:r>
+        <w:rPr>
+          <w:rFonts w:ascii="Calibri" w:hAnsi="Calibri" w:eastAsia="Microsoft YaHei"/>
+          <w:b w:val="0"/>
+          <w:i w:val="0"/>
+          <w:color w:val="000000"/>
+          <w:sz w:val="21"/>
+        </w:rPr>
+        <w:t xml:space="preserve"> Pareto 对照与整方案任务分配上界。</w:t>
       </w:r>
     </w:p>
     <w:p>

</xml_diff>